<commit_message>
after claude suggest fixes - not tested
</commit_message>
<xml_diff>
--- a/TMG deploy.docx
+++ b/TMG deploy.docx
@@ -29,6 +29,7 @@
         <w:r>
           <w:rPr>
             <w:rStyle w:val="Hyperlink"/>
+            <w:noProof/>
           </w:rPr>
           <w:drawing>
             <wp:inline distT="0" distB="0" distL="0" distR="0" wp14:anchorId="43BD5102" wp14:editId="069AC76A">
@@ -93,6 +94,7 @@
         <w:r>
           <w:rPr>
             <w:rStyle w:val="Hyperlink"/>
+            <w:noProof/>
           </w:rPr>
           <w:drawing>
             <wp:inline distT="0" distB="0" distL="0" distR="0" wp14:anchorId="50D9A0FA" wp14:editId="2BF297E9">
@@ -168,6 +170,7 @@
         <w:r>
           <w:rPr>
             <w:rStyle w:val="Hyperlink"/>
+            <w:noProof/>
           </w:rPr>
           <w:drawing>
             <wp:inline distT="0" distB="0" distL="0" distR="0" wp14:anchorId="48017C33" wp14:editId="4AD64D37">
@@ -234,6 +237,7 @@
         <w:r>
           <w:rPr>
             <w:rStyle w:val="Hyperlink"/>
+            <w:noProof/>
           </w:rPr>
           <w:drawing>
             <wp:inline distT="0" distB="0" distL="0" distR="0" wp14:anchorId="7C068126" wp14:editId="183342DD">
@@ -308,23 +312,1069 @@
       </w:r>
     </w:p>
     <w:p>
-      <w:proofErr w:type="spellStart"/>
-      <w:r>
-        <w:t>npx</w:t>
-      </w:r>
-      <w:proofErr w:type="spellEnd"/>
-      <w:r>
-        <w:t xml:space="preserve"> wrangler pages deploy site --project-name=</w:t>
-      </w:r>
-      <w:proofErr w:type="spellStart"/>
-      <w:r>
-        <w:t>thementalgain</w:t>
-      </w:r>
-      <w:proofErr w:type="spellEnd"/>
-      <w:r>
-        <w:t xml:space="preserve"> --branch=main</w:t>
-      </w:r>
-    </w:p>
+      <w:r>
+        <w:t>npx wrangler pages deploy site --project-name=thementalgain --branch=main</w:t>
+      </w:r>
+    </w:p>
+    <w:p/>
+    <w:p>
+      <w:r>
+        <w:t>= = = =</w:t>
+      </w:r>
+    </w:p>
+    <w:p>
+      <w:r>
+        <w:t>Here’s a practical full Astro → Cloudflare Pages release workflow for this repo, aligned with README.md, docs/architecture.md, and your current config.</w:t>
+      </w:r>
+    </w:p>
+    <w:p>
+      <w:pPr>
+        <w:rPr>
+          <w:b/>
+          <w:bCs/>
+        </w:rPr>
+      </w:pPr>
+      <w:r>
+        <w:rPr>
+          <w:b/>
+          <w:bCs/>
+        </w:rPr>
+        <w:t>Where the project stands today</w:t>
+      </w:r>
+    </w:p>
+    <w:p>
+      <w:pPr>
+        <w:numPr>
+          <w:ilvl w:val="0"/>
+          <w:numId w:val="2"/>
+        </w:numPr>
+      </w:pPr>
+      <w:r>
+        <w:t>Astro is set to static output (astro.config.mjs → output: 'static'), so production artifacts go to dist/ after npm run build.</w:t>
+      </w:r>
+    </w:p>
+    <w:p>
+      <w:pPr>
+        <w:numPr>
+          <w:ilvl w:val="0"/>
+          <w:numId w:val="2"/>
+        </w:numPr>
+      </w:pPr>
+      <w:r>
+        <w:t>Most live pages are still under site/ (static pilot). Astro routes are only starting (src/pages/index.astro so far).</w:t>
+      </w:r>
+    </w:p>
+    <w:p>
+      <w:pPr>
+        <w:numPr>
+          <w:ilvl w:val="0"/>
+          <w:numId w:val="2"/>
+        </w:numPr>
+      </w:pPr>
+      <w:r>
+        <w:lastRenderedPageBreak/>
+        <w:t>Today’s CLI deploy (npm run deploy) uploads site/, not Astro’s dist/, and wrangler.toml still says pages_build_output_dir = "site".</w:t>
+      </w:r>
+    </w:p>
+    <w:p>
+      <w:r>
+        <w:t>A full Astro release means: the site you ship is whatever npm run build produces in dist/, and Cloudflare (or Wrangler) points at dist, not site/.</w:t>
+      </w:r>
+    </w:p>
+    <w:p>
+      <w:r>
+        <w:pict w14:anchorId="02644127">
+          <v:rect id="_x0000_i1073" style="width:0;height:1.5pt" o:hralign="center" o:hrstd="t" o:hr="t" fillcolor="#a0a0a0" stroked="f"/>
+        </w:pict>
+      </w:r>
+    </w:p>
+    <w:p>
+      <w:pPr>
+        <w:rPr>
+          <w:b/>
+          <w:bCs/>
+        </w:rPr>
+      </w:pPr>
+      <w:r>
+        <w:rPr>
+          <w:b/>
+          <w:bCs/>
+        </w:rPr>
+        <w:t>1. Finish (or scope) the Astro site</w:t>
+      </w:r>
+    </w:p>
+    <w:p>
+      <w:r>
+        <w:t>Before calling it a full release:</w:t>
+      </w:r>
+    </w:p>
+    <w:p>
+      <w:pPr>
+        <w:numPr>
+          <w:ilvl w:val="0"/>
+          <w:numId w:val="3"/>
+        </w:numPr>
+      </w:pPr>
+      <w:r>
+        <w:t>Implement routes under src/pages/ for every URL you need (contact, services, about, etc.).</w:t>
+      </w:r>
+    </w:p>
+    <w:p>
+      <w:pPr>
+        <w:numPr>
+          <w:ilvl w:val="0"/>
+          <w:numId w:val="3"/>
+        </w:numPr>
+      </w:pPr>
+      <w:r>
+        <w:t>Keep copy in content/pages/ and nav in content/config/site.json per your architecture.</w:t>
+      </w:r>
+    </w:p>
+    <w:p>
+      <w:pPr>
+        <w:numPr>
+          <w:ilvl w:val="0"/>
+          <w:numId w:val="3"/>
+        </w:numPr>
+      </w:pPr>
+      <w:r>
+        <w:t>Put static assets in public/ (they copy into dist/ on build).</w:t>
+      </w:r>
+    </w:p>
+    <w:p>
+      <w:pPr>
+        <w:numPr>
+          <w:ilvl w:val="0"/>
+          <w:numId w:val="3"/>
+        </w:numPr>
+      </w:pPr>
+      <w:r>
+        <w:t>Wire the contact form on the Astro contact page (Web3Forms is fine for static hosting; key can stay in HTML or move to env if you add a build-time inject later).</w:t>
+      </w:r>
+    </w:p>
+    <w:p>
+      <w:r>
+        <w:t>Until those pages exist, npm run build will only ship what Astro actually builds (mostly the home route today).</w:t>
+      </w:r>
+    </w:p>
+    <w:p>
+      <w:r>
+        <w:pict w14:anchorId="5B243229">
+          <v:rect id="_x0000_i1074" style="width:0;height:1.5pt" o:hralign="center" o:hrstd="t" o:hr="t" fillcolor="#a0a0a0" stroked="f"/>
+        </w:pict>
+      </w:r>
+    </w:p>
+    <w:p>
+      <w:pPr>
+        <w:rPr>
+          <w:b/>
+          <w:bCs/>
+        </w:rPr>
+      </w:pPr>
+      <w:r>
+        <w:rPr>
+          <w:b/>
+          <w:bCs/>
+        </w:rPr>
+        <w:t>2. Verify locally (release gate)</w:t>
+      </w:r>
+    </w:p>
+    <w:p>
+      <w:r>
+        <w:t>On Node ≥ 22.12 (per package.json):</w:t>
+      </w:r>
+    </w:p>
+    <w:p>
+      <w:r>
+        <w:t>npm install</w:t>
+      </w:r>
+    </w:p>
+    <w:p>
+      <w:r>
+        <w:t xml:space="preserve">npm run dev          </w:t>
+      </w:r>
+      <w:r>
+        <w:rPr>
+          <w:i/>
+          <w:iCs/>
+        </w:rPr>
+        <w:t># develop at http://localhost:4321</w:t>
+      </w:r>
+    </w:p>
+    <w:p>
+      <w:r>
+        <w:t xml:space="preserve">npm run build        </w:t>
+      </w:r>
+      <w:r>
+        <w:rPr>
+          <w:i/>
+          <w:iCs/>
+        </w:rPr>
+        <w:t># must succeed; output → dist/</w:t>
+      </w:r>
+    </w:p>
+    <w:p>
+      <w:r>
+        <w:t xml:space="preserve">npm run preview      </w:t>
+      </w:r>
+      <w:r>
+        <w:rPr>
+          <w:i/>
+          <w:iCs/>
+        </w:rPr>
+        <w:t># smoke-test the production build locally</w:t>
+      </w:r>
+    </w:p>
+    <w:p>
+      <w:r>
+        <w:t>Check: nav, mobile menu, forms, images, and any public/_headers behavior.</w:t>
+      </w:r>
+    </w:p>
+    <w:p>
+      <w:r>
+        <w:pict w14:anchorId="16A52332">
+          <v:rect id="_x0000_i1075" style="width:0;height:1.5pt" o:hralign="center" o:hrstd="t" o:hr="t" fillcolor="#a0a0a0" stroked="f"/>
+        </w:pict>
+      </w:r>
+    </w:p>
+    <w:p>
+      <w:pPr>
+        <w:rPr>
+          <w:b/>
+          <w:bCs/>
+        </w:rPr>
+      </w:pPr>
+      <w:r>
+        <w:rPr>
+          <w:b/>
+          <w:bCs/>
+        </w:rPr>
+        <w:t>3. Align repo config for Astro deploys</w:t>
+      </w:r>
+    </w:p>
+    <w:p>
+      <w:r>
+        <w:t>When Astro is the source of truth, you’ll want these consistent (you’d change them in Agent mode or by hand):</w:t>
+      </w:r>
+    </w:p>
+    <w:tbl>
+      <w:tblPr>
+        <w:tblW w:w="0" w:type="auto"/>
+        <w:tblCellMar>
+          <w:top w:w="15" w:type="dxa"/>
+          <w:left w:w="15" w:type="dxa"/>
+          <w:bottom w:w="15" w:type="dxa"/>
+          <w:right w:w="15" w:type="dxa"/>
+        </w:tblCellMar>
+        <w:tblLook w:val="04A0" w:firstRow="1" w:lastRow="0" w:firstColumn="1" w:lastColumn="0" w:noHBand="0" w:noVBand="1"/>
+      </w:tblPr>
+      <w:tblGrid>
+        <w:gridCol w:w="4378"/>
+        <w:gridCol w:w="4982"/>
+      </w:tblGrid>
+      <w:tr>
+        <w:trPr>
+          <w:tblHeader/>
+        </w:trPr>
+        <w:tc>
+          <w:tcPr>
+            <w:tcW w:w="0" w:type="auto"/>
+            <w:noWrap/>
+            <w:tcMar>
+              <w:top w:w="90" w:type="dxa"/>
+              <w:left w:w="150" w:type="dxa"/>
+              <w:bottom w:w="90" w:type="dxa"/>
+              <w:right w:w="150" w:type="dxa"/>
+            </w:tcMar>
+            <w:hideMark/>
+          </w:tcPr>
+          <w:p>
+            <w:pPr>
+              <w:rPr>
+                <w:b/>
+                <w:bCs/>
+              </w:rPr>
+            </w:pPr>
+            <w:r>
+              <w:rPr>
+                <w:b/>
+                <w:bCs/>
+              </w:rPr>
+              <w:lastRenderedPageBreak/>
+              <w:t>Piece</w:t>
+            </w:r>
+          </w:p>
+        </w:tc>
+        <w:tc>
+          <w:tcPr>
+            <w:tcW w:w="0" w:type="auto"/>
+            <w:noWrap/>
+            <w:tcMar>
+              <w:top w:w="90" w:type="dxa"/>
+              <w:left w:w="150" w:type="dxa"/>
+              <w:bottom w:w="90" w:type="dxa"/>
+              <w:right w:w="150" w:type="dxa"/>
+            </w:tcMar>
+            <w:hideMark/>
+          </w:tcPr>
+          <w:p>
+            <w:pPr>
+              <w:rPr>
+                <w:b/>
+                <w:bCs/>
+              </w:rPr>
+            </w:pPr>
+            <w:r>
+              <w:rPr>
+                <w:b/>
+                <w:bCs/>
+              </w:rPr>
+              <w:t>Target for Astro full release</w:t>
+            </w:r>
+          </w:p>
+        </w:tc>
+      </w:tr>
+      <w:tr>
+        <w:tc>
+          <w:tcPr>
+            <w:tcW w:w="0" w:type="auto"/>
+            <w:tcMar>
+              <w:top w:w="90" w:type="dxa"/>
+              <w:left w:w="150" w:type="dxa"/>
+              <w:bottom w:w="90" w:type="dxa"/>
+              <w:right w:w="150" w:type="dxa"/>
+            </w:tcMar>
+            <w:hideMark/>
+          </w:tcPr>
+          <w:p>
+            <w:r>
+              <w:t>Cloudflare build command</w:t>
+            </w:r>
+          </w:p>
+        </w:tc>
+        <w:tc>
+          <w:tcPr>
+            <w:tcW w:w="0" w:type="auto"/>
+            <w:tcMar>
+              <w:top w:w="90" w:type="dxa"/>
+              <w:left w:w="150" w:type="dxa"/>
+              <w:bottom w:w="90" w:type="dxa"/>
+              <w:right w:w="150" w:type="dxa"/>
+            </w:tcMar>
+            <w:hideMark/>
+          </w:tcPr>
+          <w:p>
+            <w:r>
+              <w:t>npm run build</w:t>
+            </w:r>
+          </w:p>
+        </w:tc>
+      </w:tr>
+      <w:tr>
+        <w:tc>
+          <w:tcPr>
+            <w:tcW w:w="0" w:type="auto"/>
+            <w:tcMar>
+              <w:top w:w="90" w:type="dxa"/>
+              <w:left w:w="150" w:type="dxa"/>
+              <w:bottom w:w="90" w:type="dxa"/>
+              <w:right w:w="150" w:type="dxa"/>
+            </w:tcMar>
+            <w:hideMark/>
+          </w:tcPr>
+          <w:p>
+            <w:r>
+              <w:t>Build output directory</w:t>
+            </w:r>
+          </w:p>
+        </w:tc>
+        <w:tc>
+          <w:tcPr>
+            <w:tcW w:w="0" w:type="auto"/>
+            <w:tcMar>
+              <w:top w:w="90" w:type="dxa"/>
+              <w:left w:w="150" w:type="dxa"/>
+              <w:bottom w:w="90" w:type="dxa"/>
+              <w:right w:w="150" w:type="dxa"/>
+            </w:tcMar>
+            <w:hideMark/>
+          </w:tcPr>
+          <w:p>
+            <w:r>
+              <w:t>dist</w:t>
+            </w:r>
+          </w:p>
+        </w:tc>
+      </w:tr>
+      <w:tr>
+        <w:tc>
+          <w:tcPr>
+            <w:tcW w:w="0" w:type="auto"/>
+            <w:tcMar>
+              <w:top w:w="90" w:type="dxa"/>
+              <w:left w:w="150" w:type="dxa"/>
+              <w:bottom w:w="90" w:type="dxa"/>
+              <w:right w:w="150" w:type="dxa"/>
+            </w:tcMar>
+            <w:hideMark/>
+          </w:tcPr>
+          <w:p>
+            <w:r>
+              <w:t>wrangler.toml → pages_build_output_dir</w:t>
+            </w:r>
+          </w:p>
+        </w:tc>
+        <w:tc>
+          <w:tcPr>
+            <w:tcW w:w="0" w:type="auto"/>
+            <w:tcMar>
+              <w:top w:w="90" w:type="dxa"/>
+              <w:left w:w="150" w:type="dxa"/>
+              <w:bottom w:w="90" w:type="dxa"/>
+              <w:right w:w="150" w:type="dxa"/>
+            </w:tcMar>
+            <w:hideMark/>
+          </w:tcPr>
+          <w:p>
+            <w:r>
+              <w:t>dist (comment in file already says to switch when Astro replaces site/)</w:t>
+            </w:r>
+          </w:p>
+        </w:tc>
+      </w:tr>
+      <w:tr>
+        <w:tc>
+          <w:tcPr>
+            <w:tcW w:w="0" w:type="auto"/>
+            <w:tcMar>
+              <w:top w:w="90" w:type="dxa"/>
+              <w:left w:w="150" w:type="dxa"/>
+              <w:bottom w:w="90" w:type="dxa"/>
+              <w:right w:w="150" w:type="dxa"/>
+            </w:tcMar>
+            <w:hideMark/>
+          </w:tcPr>
+          <w:p>
+            <w:r>
+              <w:t>package.json → deploy script</w:t>
+            </w:r>
+          </w:p>
+        </w:tc>
+        <w:tc>
+          <w:tcPr>
+            <w:tcW w:w="0" w:type="auto"/>
+            <w:tcMar>
+              <w:top w:w="90" w:type="dxa"/>
+              <w:left w:w="150" w:type="dxa"/>
+              <w:bottom w:w="90" w:type="dxa"/>
+              <w:right w:w="150" w:type="dxa"/>
+            </w:tcMar>
+            <w:hideMark/>
+          </w:tcPr>
+          <w:p>
+            <w:r>
+              <w:t>Run build, then deploy dist (README describes this; the script today only deploys site/)</w:t>
+            </w:r>
+          </w:p>
+        </w:tc>
+      </w:tr>
+    </w:tbl>
+    <w:p>
+      <w:r>
+        <w:t>Example manual CLI flow after that alignment:</w:t>
+      </w:r>
+    </w:p>
+    <w:p>
+      <w:r>
+        <w:t xml:space="preserve">npx wrangler login          </w:t>
+      </w:r>
+      <w:r>
+        <w:rPr>
+          <w:i/>
+          <w:iCs/>
+        </w:rPr>
+        <w:t># once per machine</w:t>
+      </w:r>
+    </w:p>
+    <w:p>
+      <w:r>
+        <w:t>npm run build</w:t>
+      </w:r>
+    </w:p>
+    <w:p>
+      <w:r>
+        <w:t>npx wrangler pages deploy dist --project-name=thementalgain</w:t>
+      </w:r>
+    </w:p>
+    <w:p>
+      <w:r>
+        <w:t>(or a single npm run deploy that chains build + deploy)</w:t>
+      </w:r>
+    </w:p>
+    <w:p>
+      <w:r>
+        <w:pict w14:anchorId="5843E68A">
+          <v:rect id="_x0000_i1076" style="width:0;height:1.5pt" o:hralign="center" o:hrstd="t" o:hr="t" fillcolor="#a0a0a0" stroked="f"/>
+        </w:pict>
+      </w:r>
+    </w:p>
+    <w:p>
+      <w:pPr>
+        <w:rPr>
+          <w:b/>
+          <w:bCs/>
+        </w:rPr>
+      </w:pPr>
+      <w:r>
+        <w:rPr>
+          <w:b/>
+          <w:bCs/>
+        </w:rPr>
+        <w:t>4. Cloudflare Pages — production (Git) “full release”</w:t>
+      </w:r>
+    </w:p>
+    <w:p>
+      <w:r>
+        <w:t>This is the usual full release path: every merge to main builds and promotes production.</w:t>
+      </w:r>
+    </w:p>
+    <w:p>
+      <w:pPr>
+        <w:numPr>
+          <w:ilvl w:val="0"/>
+          <w:numId w:val="4"/>
+        </w:numPr>
+      </w:pPr>
+      <w:r>
+        <w:t>Cloudflare Dashboard → Workers &amp; Pages → project thementalgain (or create it).</w:t>
+      </w:r>
+    </w:p>
+    <w:p>
+      <w:pPr>
+        <w:numPr>
+          <w:ilvl w:val="0"/>
+          <w:numId w:val="4"/>
+        </w:numPr>
+      </w:pPr>
+      <w:r>
+        <w:t>Connect to Git → GitHub repo davidvb11758/thementalgain (or your fork).</w:t>
+      </w:r>
+    </w:p>
+    <w:p>
+      <w:pPr>
+        <w:numPr>
+          <w:ilvl w:val="0"/>
+          <w:numId w:val="4"/>
+        </w:numPr>
+      </w:pPr>
+      <w:r>
+        <w:t>Production branch: main (or your chosen branch).</w:t>
+      </w:r>
+    </w:p>
+    <w:p>
+      <w:pPr>
+        <w:numPr>
+          <w:ilvl w:val="0"/>
+          <w:numId w:val="4"/>
+        </w:numPr>
+      </w:pPr>
+      <w:r>
+        <w:t>Build settings:</w:t>
+      </w:r>
+    </w:p>
+    <w:p>
+      <w:pPr>
+        <w:numPr>
+          <w:ilvl w:val="1"/>
+          <w:numId w:val="4"/>
+        </w:numPr>
+      </w:pPr>
+      <w:r>
+        <w:t>Framework preset: Astro (or “None” with custom commands).</w:t>
+      </w:r>
+    </w:p>
+    <w:p>
+      <w:pPr>
+        <w:numPr>
+          <w:ilvl w:val="1"/>
+          <w:numId w:val="4"/>
+        </w:numPr>
+      </w:pPr>
+      <w:r>
+        <w:t>Build command: npm run build</w:t>
+      </w:r>
+    </w:p>
+    <w:p>
+      <w:pPr>
+        <w:numPr>
+          <w:ilvl w:val="1"/>
+          <w:numId w:val="4"/>
+        </w:numPr>
+      </w:pPr>
+      <w:r>
+        <w:t>Build output directory: dist</w:t>
+      </w:r>
+    </w:p>
+    <w:p>
+      <w:pPr>
+        <w:numPr>
+          <w:ilvl w:val="1"/>
+          <w:numId w:val="4"/>
+        </w:numPr>
+      </w:pPr>
+      <w:r>
+        <w:t>Root directory: / (repo root)</w:t>
+      </w:r>
+    </w:p>
+    <w:p>
+      <w:pPr>
+        <w:numPr>
+          <w:ilvl w:val="0"/>
+          <w:numId w:val="4"/>
+        </w:numPr>
+      </w:pPr>
+      <w:r>
+        <w:t>Environment variables (Dashboard → Settings → Environment variables):</w:t>
+      </w:r>
+    </w:p>
+    <w:p>
+      <w:pPr>
+        <w:numPr>
+          <w:ilvl w:val="1"/>
+          <w:numId w:val="4"/>
+        </w:numPr>
+      </w:pPr>
+      <w:r>
+        <w:lastRenderedPageBreak/>
+        <w:t>Production (and Preview if needed): anything from .env.example you actually use.</w:t>
+      </w:r>
+    </w:p>
+    <w:p>
+      <w:pPr>
+        <w:numPr>
+          <w:ilvl w:val="1"/>
+          <w:numId w:val="4"/>
+        </w:numPr>
+      </w:pPr>
+      <w:r>
+        <w:t>Web3Forms: production access key is often in HTML; if you later use PUBLIC_* or build-time vars, set them here—not in git.</w:t>
+      </w:r>
+    </w:p>
+    <w:p>
+      <w:pPr>
+        <w:numPr>
+          <w:ilvl w:val="0"/>
+          <w:numId w:val="4"/>
+        </w:numPr>
+      </w:pPr>
+      <w:r>
+        <w:t>Node version: set 22 (Pages → Settings → Environment variables or Build configuration / NODE_VERSION=22 depending on your project UI).</w:t>
+      </w:r>
+    </w:p>
+    <w:p>
+      <w:pPr>
+        <w:numPr>
+          <w:ilvl w:val="0"/>
+          <w:numId w:val="4"/>
+        </w:numPr>
+      </w:pPr>
+      <w:r>
+        <w:t>Save and Deploy (first build from Git).</w:t>
+      </w:r>
+    </w:p>
+    <w:p>
+      <w:r>
+        <w:t>After success, Cloudflare gives you *.pages.dev URLs; production is tied to the production branch.</w:t>
+      </w:r>
+    </w:p>
+    <w:p>
+      <w:r>
+        <w:pict w14:anchorId="3FF030DF">
+          <v:rect id="_x0000_i1077" style="width:0;height:1.5pt" o:hralign="center" o:hrstd="t" o:hr="t" fillcolor="#a0a0a0" stroked="f"/>
+        </w:pict>
+      </w:r>
+    </w:p>
+    <w:p>
+      <w:pPr>
+        <w:rPr>
+          <w:b/>
+          <w:bCs/>
+        </w:rPr>
+      </w:pPr>
+      <w:r>
+        <w:rPr>
+          <w:b/>
+          <w:bCs/>
+        </w:rPr>
+        <w:t>5. Custom domain (thementalgain.com)</w:t>
+      </w:r>
+    </w:p>
+    <w:p>
+      <w:r>
+        <w:t>From the same Pages project:</w:t>
+      </w:r>
+    </w:p>
+    <w:p>
+      <w:pPr>
+        <w:numPr>
+          <w:ilvl w:val="0"/>
+          <w:numId w:val="5"/>
+        </w:numPr>
+      </w:pPr>
+      <w:r>
+        <w:t>Custom domains → add thementalgain.com and www if you use it.</w:t>
+      </w:r>
+    </w:p>
+    <w:p>
+      <w:pPr>
+        <w:numPr>
+          <w:ilvl w:val="0"/>
+          <w:numId w:val="5"/>
+        </w:numPr>
+      </w:pPr>
+      <w:r>
+        <w:t>Cloudflare will show DNS records (often CNAME to thementalgain.pages.dev or flattening if the zone is on Cloudflare).</w:t>
+      </w:r>
+    </w:p>
+    <w:p>
+      <w:pPr>
+        <w:numPr>
+          <w:ilvl w:val="0"/>
+          <w:numId w:val="5"/>
+        </w:numPr>
+      </w:pPr>
+      <w:r>
+        <w:t>Wait for Active / SSL provisioning.</w:t>
+      </w:r>
+    </w:p>
+    <w:p>
+      <w:pPr>
+        <w:numPr>
+          <w:ilvl w:val="0"/>
+          <w:numId w:val="5"/>
+        </w:numPr>
+      </w:pPr>
+      <w:r>
+        <w:t>Per README: keep master.thementalgain.com on InMotion/WordPress if that subdomain should stay separate—don’t point it at this Pages project unless you intend to migrate it.</w:t>
+      </w:r>
+    </w:p>
+    <w:p>
+      <w:r>
+        <w:t>astro.config.mjs already has site: 'https://thementalgain.com' for canonical/sitemap-style URLs once you add those features.</w:t>
+      </w:r>
+    </w:p>
+    <w:p>
+      <w:r>
+        <w:pict w14:anchorId="7C8FB4B3">
+          <v:rect id="_x0000_i1078" style="width:0;height:1.5pt" o:hralign="center" o:hrstd="t" o:hr="t" fillcolor="#a0a0a0" stroked="f"/>
+        </w:pict>
+      </w:r>
+    </w:p>
+    <w:p>
+      <w:pPr>
+        <w:rPr>
+          <w:b/>
+          <w:bCs/>
+        </w:rPr>
+      </w:pPr>
+      <w:r>
+        <w:rPr>
+          <w:b/>
+          <w:bCs/>
+        </w:rPr>
+        <w:t>6. What counts as “full release” vs preview</w:t>
+      </w:r>
+    </w:p>
+    <w:tbl>
+      <w:tblPr>
+        <w:tblW w:w="0" w:type="auto"/>
+        <w:tblCellMar>
+          <w:top w:w="15" w:type="dxa"/>
+          <w:left w:w="15" w:type="dxa"/>
+          <w:bottom w:w="15" w:type="dxa"/>
+          <w:right w:w="15" w:type="dxa"/>
+        </w:tblCellMar>
+        <w:tblLook w:val="04A0" w:firstRow="1" w:lastRow="0" w:firstColumn="1" w:lastColumn="0" w:noHBand="0" w:noVBand="1"/>
+      </w:tblPr>
+      <w:tblGrid>
+        <w:gridCol w:w="2690"/>
+        <w:gridCol w:w="6670"/>
+      </w:tblGrid>
+      <w:tr>
+        <w:trPr>
+          <w:tblHeader/>
+        </w:trPr>
+        <w:tc>
+          <w:tcPr>
+            <w:tcW w:w="0" w:type="auto"/>
+            <w:noWrap/>
+            <w:tcMar>
+              <w:top w:w="90" w:type="dxa"/>
+              <w:left w:w="150" w:type="dxa"/>
+              <w:bottom w:w="90" w:type="dxa"/>
+              <w:right w:w="150" w:type="dxa"/>
+            </w:tcMar>
+            <w:hideMark/>
+          </w:tcPr>
+          <w:p>
+            <w:pPr>
+              <w:rPr>
+                <w:b/>
+                <w:bCs/>
+              </w:rPr>
+            </w:pPr>
+            <w:r>
+              <w:rPr>
+                <w:b/>
+                <w:bCs/>
+              </w:rPr>
+              <w:t>Method</w:t>
+            </w:r>
+          </w:p>
+        </w:tc>
+        <w:tc>
+          <w:tcPr>
+            <w:tcW w:w="0" w:type="auto"/>
+            <w:noWrap/>
+            <w:tcMar>
+              <w:top w:w="90" w:type="dxa"/>
+              <w:left w:w="150" w:type="dxa"/>
+              <w:bottom w:w="90" w:type="dxa"/>
+              <w:right w:w="150" w:type="dxa"/>
+            </w:tcMar>
+            <w:hideMark/>
+          </w:tcPr>
+          <w:p>
+            <w:pPr>
+              <w:rPr>
+                <w:b/>
+                <w:bCs/>
+              </w:rPr>
+            </w:pPr>
+            <w:r>
+              <w:rPr>
+                <w:b/>
+                <w:bCs/>
+              </w:rPr>
+              <w:t>Use case</w:t>
+            </w:r>
+          </w:p>
+        </w:tc>
+      </w:tr>
+      <w:tr>
+        <w:tc>
+          <w:tcPr>
+            <w:tcW w:w="0" w:type="auto"/>
+            <w:tcMar>
+              <w:top w:w="90" w:type="dxa"/>
+              <w:left w:w="150" w:type="dxa"/>
+              <w:bottom w:w="90" w:type="dxa"/>
+              <w:right w:w="150" w:type="dxa"/>
+            </w:tcMar>
+            <w:hideMark/>
+          </w:tcPr>
+          <w:p>
+            <w:r>
+              <w:t>Git push to main</w:t>
+            </w:r>
+          </w:p>
+        </w:tc>
+        <w:tc>
+          <w:tcPr>
+            <w:tcW w:w="0" w:type="auto"/>
+            <w:tcMar>
+              <w:top w:w="90" w:type="dxa"/>
+              <w:left w:w="150" w:type="dxa"/>
+              <w:bottom w:w="90" w:type="dxa"/>
+              <w:right w:w="150" w:type="dxa"/>
+            </w:tcMar>
+            <w:hideMark/>
+          </w:tcPr>
+          <w:p>
+            <w:r>
+              <w:t>Production release; repeatable, auditable</w:t>
+            </w:r>
+          </w:p>
+        </w:tc>
+      </w:tr>
+      <w:tr>
+        <w:tc>
+          <w:tcPr>
+            <w:tcW w:w="0" w:type="auto"/>
+            <w:tcMar>
+              <w:top w:w="90" w:type="dxa"/>
+              <w:left w:w="150" w:type="dxa"/>
+              <w:bottom w:w="90" w:type="dxa"/>
+              <w:right w:w="150" w:type="dxa"/>
+            </w:tcMar>
+            <w:hideMark/>
+          </w:tcPr>
+          <w:p>
+            <w:r>
+              <w:t>Pull request previews</w:t>
+            </w:r>
+          </w:p>
+        </w:tc>
+        <w:tc>
+          <w:tcPr>
+            <w:tcW w:w="0" w:type="auto"/>
+            <w:tcMar>
+              <w:top w:w="90" w:type="dxa"/>
+              <w:left w:w="150" w:type="dxa"/>
+              <w:bottom w:w="90" w:type="dxa"/>
+              <w:right w:w="150" w:type="dxa"/>
+            </w:tcMar>
+            <w:hideMark/>
+          </w:tcPr>
+          <w:p>
+            <w:r>
+              <w:t>Cloudflare Preview deployments per PR (optional but recommended)</w:t>
+            </w:r>
+          </w:p>
+        </w:tc>
+      </w:tr>
+      <w:tr>
+        <w:tc>
+          <w:tcPr>
+            <w:tcW w:w="0" w:type="auto"/>
+            <w:tcMar>
+              <w:top w:w="90" w:type="dxa"/>
+              <w:left w:w="150" w:type="dxa"/>
+              <w:bottom w:w="90" w:type="dxa"/>
+              <w:right w:w="150" w:type="dxa"/>
+            </w:tcMar>
+            <w:hideMark/>
+          </w:tcPr>
+          <w:p>
+            <w:r>
+              <w:lastRenderedPageBreak/>
+              <w:t>wrangler pages deploy dist</w:t>
+            </w:r>
+          </w:p>
+        </w:tc>
+        <w:tc>
+          <w:tcPr>
+            <w:tcW w:w="0" w:type="auto"/>
+            <w:tcMar>
+              <w:top w:w="90" w:type="dxa"/>
+              <w:left w:w="150" w:type="dxa"/>
+              <w:bottom w:w="90" w:type="dxa"/>
+              <w:right w:w="150" w:type="dxa"/>
+            </w:tcMar>
+            <w:hideMark/>
+          </w:tcPr>
+          <w:p>
+            <w:r>
+              <w:t>Manual upload; good for hotfixes or before Git is connected</w:t>
+            </w:r>
+          </w:p>
+        </w:tc>
+      </w:tr>
+    </w:tbl>
+    <w:p>
+      <w:r>
+        <w:t>For a full release, prefer: commit → push main → Cloudflare production build succeeds → custom domain serves new dist.</w:t>
+      </w:r>
+    </w:p>
+    <w:p>
+      <w:r>
+        <w:pict w14:anchorId="30142121">
+          <v:rect id="_x0000_i1079" style="width:0;height:1.5pt" o:hralign="center" o:hrstd="t" o:hr="t" fillcolor="#a0a0a0" stroked="f"/>
+        </w:pict>
+      </w:r>
+    </w:p>
+    <w:p>
+      <w:pPr>
+        <w:rPr>
+          <w:b/>
+          <w:bCs/>
+        </w:rPr>
+      </w:pPr>
+      <w:r>
+        <w:rPr>
+          <w:b/>
+          <w:bCs/>
+        </w:rPr>
+        <w:t>7. Post-release checklist</w:t>
+      </w:r>
+    </w:p>
+    <w:p>
+      <w:pPr>
+        <w:numPr>
+          <w:ilvl w:val="0"/>
+          <w:numId w:val="6"/>
+        </w:numPr>
+      </w:pPr>
+      <w:r>
+        <w:t>Open production URL and test Contact (Web3Forms key for production).</w:t>
+      </w:r>
+    </w:p>
+    <w:p>
+      <w:pPr>
+        <w:numPr>
+          <w:ilvl w:val="0"/>
+          <w:numId w:val="6"/>
+        </w:numPr>
+      </w:pPr>
+      <w:r>
+        <w:t>Confirm noindex only where intended (pilot site/contact.html had noindex; decide per Astro page).</w:t>
+      </w:r>
+    </w:p>
+    <w:p>
+      <w:pPr>
+        <w:numPr>
+          <w:ilvl w:val="0"/>
+          <w:numId w:val="6"/>
+        </w:numPr>
+      </w:pPr>
+      <w:r>
+        <w:t>Check headers from public/_headers on the deployed site.</w:t>
+      </w:r>
+    </w:p>
+    <w:p>
+      <w:pPr>
+        <w:numPr>
+          <w:ilvl w:val="0"/>
+          <w:numId w:val="6"/>
+        </w:numPr>
+      </w:pPr>
+      <w:r>
+        <w:t>In Web3Forms (or similar), restrict allowed domains to thementalgain.com / your pages.dev host if the dashboard supports it.</w:t>
+      </w:r>
+    </w:p>
+    <w:p>
+      <w:r>
+        <w:pict w14:anchorId="0F47AA43">
+          <v:rect id="_x0000_i1080" style="width:0;height:1.5pt" o:hralign="center" o:hrstd="t" o:hr="t" fillcolor="#a0a0a0" stroked="f"/>
+        </w:pict>
+      </w:r>
+    </w:p>
+    <w:p>
+      <w:pPr>
+        <w:rPr>
+          <w:b/>
+          <w:bCs/>
+        </w:rPr>
+      </w:pPr>
+      <w:r>
+        <w:rPr>
+          <w:b/>
+          <w:bCs/>
+        </w:rPr>
+        <w:t>Summary</w:t>
+      </w:r>
+    </w:p>
+    <w:p>
+      <w:r>
+        <w:t>Full Astro release on Cloudflare Pages = build dist with npm run build, connect Git with that build/output, set Node 22, configure production env vars and custom domain, then ship via main. Your repo is architecturally set up for that; operationally you still deploy the site/ pilot until Astro pages replace it and wrangler.toml / deploy script / Pages settings all target dist.</w:t>
+      </w:r>
+    </w:p>
+    <w:p>
+      <w:r>
+        <w:t>If you want this wired in the repo (deploy script, wrangler, and a note in docs), switch to Agent mode and ask for that update.</w:t>
+      </w:r>
+    </w:p>
+    <w:p/>
     <w:p/>
     <w:sectPr>
       <w:pgSz w:w="12240" w:h="15840"/>
@@ -339,6 +1389,647 @@
 <file path=word/numbering.xml><?xml version="1.0" encoding="utf-8"?>
 <w:numbering xmlns:wpc="http://schemas.microsoft.com/office/word/2010/wordprocessingCanvas" xmlns:cx="http://schemas.microsoft.com/office/drawing/2014/chartex" xmlns:cx1="http://schemas.microsoft.com/office/drawing/2015/9/8/chartex" xmlns:cx2="http://schemas.microsoft.com/office/drawing/2015/10/21/chartex" xmlns:cx3="http://schemas.microsoft.com/office/drawing/2016/5/9/chartex" xmlns:cx4="http://schemas.microsoft.com/office/drawing/2016/5/10/chartex" xmlns:cx5="http://schemas.microsoft.com/office/drawing/2016/5/11/chartex" xmlns:cx6="http://schemas.microsoft.com/office/drawing/2016/5/12/chartex" xmlns:cx7="http://schemas.microsoft.com/office/drawing/2016/5/13/chartex" xmlns:cx8="http://schemas.microsoft.com/office/drawing/2016/5/14/chartex" xmlns:mc="http://schemas.openxmlformats.org/markup-compatibility/2006" xmlns:aink="http://schemas.microsoft.com/office/drawing/2016/ink" xmlns:am3d="http://schemas.microsoft.com/office/drawing/2017/model3d" xmlns:o="urn:schemas-microsoft-com:office:office" xmlns:oel="http://schemas.microsoft.com/office/2019/extlst" xmlns:r="http://schemas.openxmlformats.org/officeDocument/2006/relationships" xmlns:m="http://schemas.openxmlformats.org/officeDocument/2006/math" xmlns:v="urn:schemas-microsoft-com:vml" xmlns:wp14="http://schemas.microsoft.com/office/word/2010/wordprocessingDrawing" xmlns:wp="http://schemas.openxmlformats.org/drawingml/2006/wordprocessingDrawing" xmlns:w10="urn:schemas-microsoft-com:office:word" xmlns:w="http://schemas.openxmlformats.org/wordprocessingml/2006/main" xmlns:w14="http://schemas.microsoft.com/office/word/2010/wordml" xmlns:w15="http://schemas.microsoft.com/office/word/2012/wordml" xmlns:w16cex="http://schemas.microsoft.com/office/word/2018/wordml/cex" xmlns:w16cid="http://schemas.microsoft.com/office/word/2016/wordml/cid" xmlns:w16="http://schemas.microsoft.com/office/word/2018/wordml" xmlns:w16du="http://schemas.microsoft.com/office/word/2023/wordml/word16du" xmlns:w16sdtdh="http://schemas.microsoft.com/office/word/2020/wordml/sdtdatahash" xmlns:w16sdtfl="http://schemas.microsoft.com/office/word/2024/wordml/sdtformatlock" xmlns:w16se="http://schemas.microsoft.com/office/word/2015/wordml/symex" xmlns:wpg="http://schemas.microsoft.com/office/word/2010/wordprocessingGroup" xmlns:wpi="http://schemas.microsoft.com/office/word/2010/wordprocessingInk" xmlns:wne="http://schemas.microsoft.com/office/word/2006/wordml" xmlns:wps="http://schemas.microsoft.com/office/word/2010/wordprocessingShape" mc:Ignorable="w14 w15 w16se w16cid w16 w16cex w16sdtdh w16sdtfl w16du wp14">
   <w:abstractNum w:abstractNumId="0" w15:restartNumberingAfterBreak="0">
+    <w:nsid w:val="00613DA1"/>
+    <w:multiLevelType w:val="multilevel"/>
+    <w:tmpl w:val="1FA6939C"/>
+    <w:lvl w:ilvl="0">
+      <w:start w:val="1"/>
+      <w:numFmt w:val="bullet"/>
+      <w:lvlText w:val=""/>
+      <w:lvlJc w:val="left"/>
+      <w:pPr>
+        <w:tabs>
+          <w:tab w:val="num" w:pos="720"/>
+        </w:tabs>
+        <w:ind w:left="720" w:hanging="360"/>
+      </w:pPr>
+      <w:rPr>
+        <w:rFonts w:ascii="Symbol" w:hAnsi="Symbol" w:hint="default"/>
+        <w:sz w:val="20"/>
+      </w:rPr>
+    </w:lvl>
+    <w:lvl w:ilvl="1" w:tentative="1">
+      <w:start w:val="1"/>
+      <w:numFmt w:val="bullet"/>
+      <w:lvlText w:val="o"/>
+      <w:lvlJc w:val="left"/>
+      <w:pPr>
+        <w:tabs>
+          <w:tab w:val="num" w:pos="1440"/>
+        </w:tabs>
+        <w:ind w:left="1440" w:hanging="360"/>
+      </w:pPr>
+      <w:rPr>
+        <w:rFonts w:ascii="Courier New" w:hAnsi="Courier New" w:hint="default"/>
+        <w:sz w:val="20"/>
+      </w:rPr>
+    </w:lvl>
+    <w:lvl w:ilvl="2" w:tentative="1">
+      <w:start w:val="1"/>
+      <w:numFmt w:val="bullet"/>
+      <w:lvlText w:val=""/>
+      <w:lvlJc w:val="left"/>
+      <w:pPr>
+        <w:tabs>
+          <w:tab w:val="num" w:pos="2160"/>
+        </w:tabs>
+        <w:ind w:left="2160" w:hanging="360"/>
+      </w:pPr>
+      <w:rPr>
+        <w:rFonts w:ascii="Wingdings" w:hAnsi="Wingdings" w:hint="default"/>
+        <w:sz w:val="20"/>
+      </w:rPr>
+    </w:lvl>
+    <w:lvl w:ilvl="3" w:tentative="1">
+      <w:start w:val="1"/>
+      <w:numFmt w:val="bullet"/>
+      <w:lvlText w:val=""/>
+      <w:lvlJc w:val="left"/>
+      <w:pPr>
+        <w:tabs>
+          <w:tab w:val="num" w:pos="2880"/>
+        </w:tabs>
+        <w:ind w:left="2880" w:hanging="360"/>
+      </w:pPr>
+      <w:rPr>
+        <w:rFonts w:ascii="Wingdings" w:hAnsi="Wingdings" w:hint="default"/>
+        <w:sz w:val="20"/>
+      </w:rPr>
+    </w:lvl>
+    <w:lvl w:ilvl="4" w:tentative="1">
+      <w:start w:val="1"/>
+      <w:numFmt w:val="bullet"/>
+      <w:lvlText w:val=""/>
+      <w:lvlJc w:val="left"/>
+      <w:pPr>
+        <w:tabs>
+          <w:tab w:val="num" w:pos="3600"/>
+        </w:tabs>
+        <w:ind w:left="3600" w:hanging="360"/>
+      </w:pPr>
+      <w:rPr>
+        <w:rFonts w:ascii="Wingdings" w:hAnsi="Wingdings" w:hint="default"/>
+        <w:sz w:val="20"/>
+      </w:rPr>
+    </w:lvl>
+    <w:lvl w:ilvl="5" w:tentative="1">
+      <w:start w:val="1"/>
+      <w:numFmt w:val="bullet"/>
+      <w:lvlText w:val=""/>
+      <w:lvlJc w:val="left"/>
+      <w:pPr>
+        <w:tabs>
+          <w:tab w:val="num" w:pos="4320"/>
+        </w:tabs>
+        <w:ind w:left="4320" w:hanging="360"/>
+      </w:pPr>
+      <w:rPr>
+        <w:rFonts w:ascii="Wingdings" w:hAnsi="Wingdings" w:hint="default"/>
+        <w:sz w:val="20"/>
+      </w:rPr>
+    </w:lvl>
+    <w:lvl w:ilvl="6" w:tentative="1">
+      <w:start w:val="1"/>
+      <w:numFmt w:val="bullet"/>
+      <w:lvlText w:val=""/>
+      <w:lvlJc w:val="left"/>
+      <w:pPr>
+        <w:tabs>
+          <w:tab w:val="num" w:pos="5040"/>
+        </w:tabs>
+        <w:ind w:left="5040" w:hanging="360"/>
+      </w:pPr>
+      <w:rPr>
+        <w:rFonts w:ascii="Wingdings" w:hAnsi="Wingdings" w:hint="default"/>
+        <w:sz w:val="20"/>
+      </w:rPr>
+    </w:lvl>
+    <w:lvl w:ilvl="7" w:tentative="1">
+      <w:start w:val="1"/>
+      <w:numFmt w:val="bullet"/>
+      <w:lvlText w:val=""/>
+      <w:lvlJc w:val="left"/>
+      <w:pPr>
+        <w:tabs>
+          <w:tab w:val="num" w:pos="5760"/>
+        </w:tabs>
+        <w:ind w:left="5760" w:hanging="360"/>
+      </w:pPr>
+      <w:rPr>
+        <w:rFonts w:ascii="Wingdings" w:hAnsi="Wingdings" w:hint="default"/>
+        <w:sz w:val="20"/>
+      </w:rPr>
+    </w:lvl>
+    <w:lvl w:ilvl="8" w:tentative="1">
+      <w:start w:val="1"/>
+      <w:numFmt w:val="bullet"/>
+      <w:lvlText w:val=""/>
+      <w:lvlJc w:val="left"/>
+      <w:pPr>
+        <w:tabs>
+          <w:tab w:val="num" w:pos="6480"/>
+        </w:tabs>
+        <w:ind w:left="6480" w:hanging="360"/>
+      </w:pPr>
+      <w:rPr>
+        <w:rFonts w:ascii="Wingdings" w:hAnsi="Wingdings" w:hint="default"/>
+        <w:sz w:val="20"/>
+      </w:rPr>
+    </w:lvl>
+  </w:abstractNum>
+  <w:abstractNum w:abstractNumId="1" w15:restartNumberingAfterBreak="0">
+    <w:nsid w:val="180F1AEA"/>
+    <w:multiLevelType w:val="multilevel"/>
+    <w:tmpl w:val="805E1B8A"/>
+    <w:lvl w:ilvl="0">
+      <w:start w:val="1"/>
+      <w:numFmt w:val="bullet"/>
+      <w:lvlText w:val=""/>
+      <w:lvlJc w:val="left"/>
+      <w:pPr>
+        <w:tabs>
+          <w:tab w:val="num" w:pos="720"/>
+        </w:tabs>
+        <w:ind w:left="720" w:hanging="360"/>
+      </w:pPr>
+      <w:rPr>
+        <w:rFonts w:ascii="Symbol" w:hAnsi="Symbol" w:hint="default"/>
+        <w:sz w:val="20"/>
+      </w:rPr>
+    </w:lvl>
+    <w:lvl w:ilvl="1" w:tentative="1">
+      <w:start w:val="1"/>
+      <w:numFmt w:val="bullet"/>
+      <w:lvlText w:val="o"/>
+      <w:lvlJc w:val="left"/>
+      <w:pPr>
+        <w:tabs>
+          <w:tab w:val="num" w:pos="1440"/>
+        </w:tabs>
+        <w:ind w:left="1440" w:hanging="360"/>
+      </w:pPr>
+      <w:rPr>
+        <w:rFonts w:ascii="Courier New" w:hAnsi="Courier New" w:hint="default"/>
+        <w:sz w:val="20"/>
+      </w:rPr>
+    </w:lvl>
+    <w:lvl w:ilvl="2" w:tentative="1">
+      <w:start w:val="1"/>
+      <w:numFmt w:val="bullet"/>
+      <w:lvlText w:val=""/>
+      <w:lvlJc w:val="left"/>
+      <w:pPr>
+        <w:tabs>
+          <w:tab w:val="num" w:pos="2160"/>
+        </w:tabs>
+        <w:ind w:left="2160" w:hanging="360"/>
+      </w:pPr>
+      <w:rPr>
+        <w:rFonts w:ascii="Wingdings" w:hAnsi="Wingdings" w:hint="default"/>
+        <w:sz w:val="20"/>
+      </w:rPr>
+    </w:lvl>
+    <w:lvl w:ilvl="3" w:tentative="1">
+      <w:start w:val="1"/>
+      <w:numFmt w:val="bullet"/>
+      <w:lvlText w:val=""/>
+      <w:lvlJc w:val="left"/>
+      <w:pPr>
+        <w:tabs>
+          <w:tab w:val="num" w:pos="2880"/>
+        </w:tabs>
+        <w:ind w:left="2880" w:hanging="360"/>
+      </w:pPr>
+      <w:rPr>
+        <w:rFonts w:ascii="Wingdings" w:hAnsi="Wingdings" w:hint="default"/>
+        <w:sz w:val="20"/>
+      </w:rPr>
+    </w:lvl>
+    <w:lvl w:ilvl="4" w:tentative="1">
+      <w:start w:val="1"/>
+      <w:numFmt w:val="bullet"/>
+      <w:lvlText w:val=""/>
+      <w:lvlJc w:val="left"/>
+      <w:pPr>
+        <w:tabs>
+          <w:tab w:val="num" w:pos="3600"/>
+        </w:tabs>
+        <w:ind w:left="3600" w:hanging="360"/>
+      </w:pPr>
+      <w:rPr>
+        <w:rFonts w:ascii="Wingdings" w:hAnsi="Wingdings" w:hint="default"/>
+        <w:sz w:val="20"/>
+      </w:rPr>
+    </w:lvl>
+    <w:lvl w:ilvl="5" w:tentative="1">
+      <w:start w:val="1"/>
+      <w:numFmt w:val="bullet"/>
+      <w:lvlText w:val=""/>
+      <w:lvlJc w:val="left"/>
+      <w:pPr>
+        <w:tabs>
+          <w:tab w:val="num" w:pos="4320"/>
+        </w:tabs>
+        <w:ind w:left="4320" w:hanging="360"/>
+      </w:pPr>
+      <w:rPr>
+        <w:rFonts w:ascii="Wingdings" w:hAnsi="Wingdings" w:hint="default"/>
+        <w:sz w:val="20"/>
+      </w:rPr>
+    </w:lvl>
+    <w:lvl w:ilvl="6" w:tentative="1">
+      <w:start w:val="1"/>
+      <w:numFmt w:val="bullet"/>
+      <w:lvlText w:val=""/>
+      <w:lvlJc w:val="left"/>
+      <w:pPr>
+        <w:tabs>
+          <w:tab w:val="num" w:pos="5040"/>
+        </w:tabs>
+        <w:ind w:left="5040" w:hanging="360"/>
+      </w:pPr>
+      <w:rPr>
+        <w:rFonts w:ascii="Wingdings" w:hAnsi="Wingdings" w:hint="default"/>
+        <w:sz w:val="20"/>
+      </w:rPr>
+    </w:lvl>
+    <w:lvl w:ilvl="7" w:tentative="1">
+      <w:start w:val="1"/>
+      <w:numFmt w:val="bullet"/>
+      <w:lvlText w:val=""/>
+      <w:lvlJc w:val="left"/>
+      <w:pPr>
+        <w:tabs>
+          <w:tab w:val="num" w:pos="5760"/>
+        </w:tabs>
+        <w:ind w:left="5760" w:hanging="360"/>
+      </w:pPr>
+      <w:rPr>
+        <w:rFonts w:ascii="Wingdings" w:hAnsi="Wingdings" w:hint="default"/>
+        <w:sz w:val="20"/>
+      </w:rPr>
+    </w:lvl>
+    <w:lvl w:ilvl="8" w:tentative="1">
+      <w:start w:val="1"/>
+      <w:numFmt w:val="bullet"/>
+      <w:lvlText w:val=""/>
+      <w:lvlJc w:val="left"/>
+      <w:pPr>
+        <w:tabs>
+          <w:tab w:val="num" w:pos="6480"/>
+        </w:tabs>
+        <w:ind w:left="6480" w:hanging="360"/>
+      </w:pPr>
+      <w:rPr>
+        <w:rFonts w:ascii="Wingdings" w:hAnsi="Wingdings" w:hint="default"/>
+        <w:sz w:val="20"/>
+      </w:rPr>
+    </w:lvl>
+  </w:abstractNum>
+  <w:abstractNum w:abstractNumId="2" w15:restartNumberingAfterBreak="0">
+    <w:nsid w:val="299F74D8"/>
+    <w:multiLevelType w:val="multilevel"/>
+    <w:tmpl w:val="941EE994"/>
+    <w:lvl w:ilvl="0">
+      <w:start w:val="1"/>
+      <w:numFmt w:val="decimal"/>
+      <w:lvlText w:val="%1."/>
+      <w:lvlJc w:val="left"/>
+      <w:pPr>
+        <w:tabs>
+          <w:tab w:val="num" w:pos="720"/>
+        </w:tabs>
+        <w:ind w:left="720" w:hanging="360"/>
+      </w:pPr>
+    </w:lvl>
+    <w:lvl w:ilvl="1" w:tentative="1">
+      <w:start w:val="1"/>
+      <w:numFmt w:val="decimal"/>
+      <w:lvlText w:val="%2."/>
+      <w:lvlJc w:val="left"/>
+      <w:pPr>
+        <w:tabs>
+          <w:tab w:val="num" w:pos="1440"/>
+        </w:tabs>
+        <w:ind w:left="1440" w:hanging="360"/>
+      </w:pPr>
+    </w:lvl>
+    <w:lvl w:ilvl="2" w:tentative="1">
+      <w:start w:val="1"/>
+      <w:numFmt w:val="decimal"/>
+      <w:lvlText w:val="%3."/>
+      <w:lvlJc w:val="left"/>
+      <w:pPr>
+        <w:tabs>
+          <w:tab w:val="num" w:pos="2160"/>
+        </w:tabs>
+        <w:ind w:left="2160" w:hanging="360"/>
+      </w:pPr>
+    </w:lvl>
+    <w:lvl w:ilvl="3" w:tentative="1">
+      <w:start w:val="1"/>
+      <w:numFmt w:val="decimal"/>
+      <w:lvlText w:val="%4."/>
+      <w:lvlJc w:val="left"/>
+      <w:pPr>
+        <w:tabs>
+          <w:tab w:val="num" w:pos="2880"/>
+        </w:tabs>
+        <w:ind w:left="2880" w:hanging="360"/>
+      </w:pPr>
+    </w:lvl>
+    <w:lvl w:ilvl="4" w:tentative="1">
+      <w:start w:val="1"/>
+      <w:numFmt w:val="decimal"/>
+      <w:lvlText w:val="%5."/>
+      <w:lvlJc w:val="left"/>
+      <w:pPr>
+        <w:tabs>
+          <w:tab w:val="num" w:pos="3600"/>
+        </w:tabs>
+        <w:ind w:left="3600" w:hanging="360"/>
+      </w:pPr>
+    </w:lvl>
+    <w:lvl w:ilvl="5" w:tentative="1">
+      <w:start w:val="1"/>
+      <w:numFmt w:val="decimal"/>
+      <w:lvlText w:val="%6."/>
+      <w:lvlJc w:val="left"/>
+      <w:pPr>
+        <w:tabs>
+          <w:tab w:val="num" w:pos="4320"/>
+        </w:tabs>
+        <w:ind w:left="4320" w:hanging="360"/>
+      </w:pPr>
+    </w:lvl>
+    <w:lvl w:ilvl="6" w:tentative="1">
+      <w:start w:val="1"/>
+      <w:numFmt w:val="decimal"/>
+      <w:lvlText w:val="%7."/>
+      <w:lvlJc w:val="left"/>
+      <w:pPr>
+        <w:tabs>
+          <w:tab w:val="num" w:pos="5040"/>
+        </w:tabs>
+        <w:ind w:left="5040" w:hanging="360"/>
+      </w:pPr>
+    </w:lvl>
+    <w:lvl w:ilvl="7" w:tentative="1">
+      <w:start w:val="1"/>
+      <w:numFmt w:val="decimal"/>
+      <w:lvlText w:val="%8."/>
+      <w:lvlJc w:val="left"/>
+      <w:pPr>
+        <w:tabs>
+          <w:tab w:val="num" w:pos="5760"/>
+        </w:tabs>
+        <w:ind w:left="5760" w:hanging="360"/>
+      </w:pPr>
+    </w:lvl>
+    <w:lvl w:ilvl="8" w:tentative="1">
+      <w:start w:val="1"/>
+      <w:numFmt w:val="decimal"/>
+      <w:lvlText w:val="%9."/>
+      <w:lvlJc w:val="left"/>
+      <w:pPr>
+        <w:tabs>
+          <w:tab w:val="num" w:pos="6480"/>
+        </w:tabs>
+        <w:ind w:left="6480" w:hanging="360"/>
+      </w:pPr>
+    </w:lvl>
+  </w:abstractNum>
+  <w:abstractNum w:abstractNumId="3" w15:restartNumberingAfterBreak="0">
+    <w:nsid w:val="4F8F6968"/>
+    <w:multiLevelType w:val="multilevel"/>
+    <w:tmpl w:val="32E618F2"/>
+    <w:lvl w:ilvl="0">
+      <w:start w:val="1"/>
+      <w:numFmt w:val="decimal"/>
+      <w:lvlText w:val="%1."/>
+      <w:lvlJc w:val="left"/>
+      <w:pPr>
+        <w:tabs>
+          <w:tab w:val="num" w:pos="720"/>
+        </w:tabs>
+        <w:ind w:left="720" w:hanging="360"/>
+      </w:pPr>
+    </w:lvl>
+    <w:lvl w:ilvl="1" w:tentative="1">
+      <w:start w:val="1"/>
+      <w:numFmt w:val="decimal"/>
+      <w:lvlText w:val="%2."/>
+      <w:lvlJc w:val="left"/>
+      <w:pPr>
+        <w:tabs>
+          <w:tab w:val="num" w:pos="1440"/>
+        </w:tabs>
+        <w:ind w:left="1440" w:hanging="360"/>
+      </w:pPr>
+    </w:lvl>
+    <w:lvl w:ilvl="2" w:tentative="1">
+      <w:start w:val="1"/>
+      <w:numFmt w:val="decimal"/>
+      <w:lvlText w:val="%3."/>
+      <w:lvlJc w:val="left"/>
+      <w:pPr>
+        <w:tabs>
+          <w:tab w:val="num" w:pos="2160"/>
+        </w:tabs>
+        <w:ind w:left="2160" w:hanging="360"/>
+      </w:pPr>
+    </w:lvl>
+    <w:lvl w:ilvl="3" w:tentative="1">
+      <w:start w:val="1"/>
+      <w:numFmt w:val="decimal"/>
+      <w:lvlText w:val="%4."/>
+      <w:lvlJc w:val="left"/>
+      <w:pPr>
+        <w:tabs>
+          <w:tab w:val="num" w:pos="2880"/>
+        </w:tabs>
+        <w:ind w:left="2880" w:hanging="360"/>
+      </w:pPr>
+    </w:lvl>
+    <w:lvl w:ilvl="4" w:tentative="1">
+      <w:start w:val="1"/>
+      <w:numFmt w:val="decimal"/>
+      <w:lvlText w:val="%5."/>
+      <w:lvlJc w:val="left"/>
+      <w:pPr>
+        <w:tabs>
+          <w:tab w:val="num" w:pos="3600"/>
+        </w:tabs>
+        <w:ind w:left="3600" w:hanging="360"/>
+      </w:pPr>
+    </w:lvl>
+    <w:lvl w:ilvl="5" w:tentative="1">
+      <w:start w:val="1"/>
+      <w:numFmt w:val="decimal"/>
+      <w:lvlText w:val="%6."/>
+      <w:lvlJc w:val="left"/>
+      <w:pPr>
+        <w:tabs>
+          <w:tab w:val="num" w:pos="4320"/>
+        </w:tabs>
+        <w:ind w:left="4320" w:hanging="360"/>
+      </w:pPr>
+    </w:lvl>
+    <w:lvl w:ilvl="6" w:tentative="1">
+      <w:start w:val="1"/>
+      <w:numFmt w:val="decimal"/>
+      <w:lvlText w:val="%7."/>
+      <w:lvlJc w:val="left"/>
+      <w:pPr>
+        <w:tabs>
+          <w:tab w:val="num" w:pos="5040"/>
+        </w:tabs>
+        <w:ind w:left="5040" w:hanging="360"/>
+      </w:pPr>
+    </w:lvl>
+    <w:lvl w:ilvl="7" w:tentative="1">
+      <w:start w:val="1"/>
+      <w:numFmt w:val="decimal"/>
+      <w:lvlText w:val="%8."/>
+      <w:lvlJc w:val="left"/>
+      <w:pPr>
+        <w:tabs>
+          <w:tab w:val="num" w:pos="5760"/>
+        </w:tabs>
+        <w:ind w:left="5760" w:hanging="360"/>
+      </w:pPr>
+    </w:lvl>
+    <w:lvl w:ilvl="8" w:tentative="1">
+      <w:start w:val="1"/>
+      <w:numFmt w:val="decimal"/>
+      <w:lvlText w:val="%9."/>
+      <w:lvlJc w:val="left"/>
+      <w:pPr>
+        <w:tabs>
+          <w:tab w:val="num" w:pos="6480"/>
+        </w:tabs>
+        <w:ind w:left="6480" w:hanging="360"/>
+      </w:pPr>
+    </w:lvl>
+  </w:abstractNum>
+  <w:abstractNum w:abstractNumId="4" w15:restartNumberingAfterBreak="0">
+    <w:nsid w:val="63F32C5D"/>
+    <w:multiLevelType w:val="multilevel"/>
+    <w:tmpl w:val="6DF239F6"/>
+    <w:lvl w:ilvl="0">
+      <w:start w:val="1"/>
+      <w:numFmt w:val="decimal"/>
+      <w:lvlText w:val="%1."/>
+      <w:lvlJc w:val="left"/>
+      <w:pPr>
+        <w:tabs>
+          <w:tab w:val="num" w:pos="720"/>
+        </w:tabs>
+        <w:ind w:left="720" w:hanging="360"/>
+      </w:pPr>
+    </w:lvl>
+    <w:lvl w:ilvl="1">
+      <w:start w:val="1"/>
+      <w:numFmt w:val="bullet"/>
+      <w:lvlText w:val="o"/>
+      <w:lvlJc w:val="left"/>
+      <w:pPr>
+        <w:tabs>
+          <w:tab w:val="num" w:pos="1440"/>
+        </w:tabs>
+        <w:ind w:left="1440" w:hanging="360"/>
+      </w:pPr>
+      <w:rPr>
+        <w:rFonts w:ascii="Courier New" w:hAnsi="Courier New" w:hint="default"/>
+        <w:sz w:val="20"/>
+      </w:rPr>
+    </w:lvl>
+    <w:lvl w:ilvl="2" w:tentative="1">
+      <w:start w:val="1"/>
+      <w:numFmt w:val="decimal"/>
+      <w:lvlText w:val="%3."/>
+      <w:lvlJc w:val="left"/>
+      <w:pPr>
+        <w:tabs>
+          <w:tab w:val="num" w:pos="2160"/>
+        </w:tabs>
+        <w:ind w:left="2160" w:hanging="360"/>
+      </w:pPr>
+    </w:lvl>
+    <w:lvl w:ilvl="3" w:tentative="1">
+      <w:start w:val="1"/>
+      <w:numFmt w:val="decimal"/>
+      <w:lvlText w:val="%4."/>
+      <w:lvlJc w:val="left"/>
+      <w:pPr>
+        <w:tabs>
+          <w:tab w:val="num" w:pos="2880"/>
+        </w:tabs>
+        <w:ind w:left="2880" w:hanging="360"/>
+      </w:pPr>
+    </w:lvl>
+    <w:lvl w:ilvl="4" w:tentative="1">
+      <w:start w:val="1"/>
+      <w:numFmt w:val="decimal"/>
+      <w:lvlText w:val="%5."/>
+      <w:lvlJc w:val="left"/>
+      <w:pPr>
+        <w:tabs>
+          <w:tab w:val="num" w:pos="3600"/>
+        </w:tabs>
+        <w:ind w:left="3600" w:hanging="360"/>
+      </w:pPr>
+    </w:lvl>
+    <w:lvl w:ilvl="5" w:tentative="1">
+      <w:start w:val="1"/>
+      <w:numFmt w:val="decimal"/>
+      <w:lvlText w:val="%6."/>
+      <w:lvlJc w:val="left"/>
+      <w:pPr>
+        <w:tabs>
+          <w:tab w:val="num" w:pos="4320"/>
+        </w:tabs>
+        <w:ind w:left="4320" w:hanging="360"/>
+      </w:pPr>
+    </w:lvl>
+    <w:lvl w:ilvl="6" w:tentative="1">
+      <w:start w:val="1"/>
+      <w:numFmt w:val="decimal"/>
+      <w:lvlText w:val="%7."/>
+      <w:lvlJc w:val="left"/>
+      <w:pPr>
+        <w:tabs>
+          <w:tab w:val="num" w:pos="5040"/>
+        </w:tabs>
+        <w:ind w:left="5040" w:hanging="360"/>
+      </w:pPr>
+    </w:lvl>
+    <w:lvl w:ilvl="7" w:tentative="1">
+      <w:start w:val="1"/>
+      <w:numFmt w:val="decimal"/>
+      <w:lvlText w:val="%8."/>
+      <w:lvlJc w:val="left"/>
+      <w:pPr>
+        <w:tabs>
+          <w:tab w:val="num" w:pos="5760"/>
+        </w:tabs>
+        <w:ind w:left="5760" w:hanging="360"/>
+      </w:pPr>
+    </w:lvl>
+    <w:lvl w:ilvl="8" w:tentative="1">
+      <w:start w:val="1"/>
+      <w:numFmt w:val="decimal"/>
+      <w:lvlText w:val="%9."/>
+      <w:lvlJc w:val="left"/>
+      <w:pPr>
+        <w:tabs>
+          <w:tab w:val="num" w:pos="6480"/>
+        </w:tabs>
+        <w:ind w:left="6480" w:hanging="360"/>
+      </w:pPr>
+    </w:lvl>
+  </w:abstractNum>
+  <w:abstractNum w:abstractNumId="5" w15:restartNumberingAfterBreak="0">
     <w:nsid w:val="71516D9E"/>
     <w:multiLevelType w:val="multilevel"/>
     <w:tmpl w:val="0FB03DB6"/>
@@ -488,6 +2179,21 @@
     </w:lvl>
   </w:abstractNum>
   <w:num w:numId="1" w16cid:durableId="2106874088">
+    <w:abstractNumId w:val="5"/>
+  </w:num>
+  <w:num w:numId="2" w16cid:durableId="2088530553">
+    <w:abstractNumId w:val="1"/>
+  </w:num>
+  <w:num w:numId="3" w16cid:durableId="1088960824">
+    <w:abstractNumId w:val="3"/>
+  </w:num>
+  <w:num w:numId="4" w16cid:durableId="207576467">
+    <w:abstractNumId w:val="4"/>
+  </w:num>
+  <w:num w:numId="5" w16cid:durableId="899369096">
+    <w:abstractNumId w:val="2"/>
+  </w:num>
+  <w:num w:numId="6" w16cid:durableId="853690591">
     <w:abstractNumId w:val="0"/>
   </w:num>
 </w:numbering>

</xml_diff>